<commit_message>
Basın bülteni gönderim için güncellendi
Tarih 15 Ağustos'tan 24 Ağustos'a alındı; 'bu hafta ISBN aldı' ifadesi
eskimişti, 'ağustos ayında ISBN aldı' oldu. Word ve PDF asıl metinden
yeniden üretildi.

Co-Authored-By: Claude Opus 5 <noreply@anthropic.com>
</commit_message>
<xml_diff>
--- a/basin/bilge-ve-yonga-basin-bulteni.docx
+++ b/basin/bilge-ve-yonga-basin-bulteni.docx
@@ -27,7 +27,7 @@
           <w:sz w:val="20"/>
           <w:szCs w:val="20"/>
         </w:rPr>
-        <w:t xml:space="preserve">Ankara, 15 Ağustos 2026</w:t>
+        <w:t xml:space="preserve">Ankara, 24 Ağustos 2026</w:t>
       </w:r>
     </w:p>
     <w:p>
@@ -96,7 +96,7 @@
           <w:sz w:val="22"/>
           <w:szCs w:val="22"/>
         </w:rPr>
-        <w:t xml:space="preserve"> adresinden ücretsiz okunabiliyor; PDF ve e-kitap biçiminde de indirilebiliyor. Serinin dört cildi Zenodo'da arşivlendi ve bu hafta ISBN aldı; böylece kitaplar kalıcı numaralarla künyelenmiş oldu.</w:t>
+        <w:t xml:space="preserve"> adresinden ücretsiz okunabiliyor; PDF ve e-kitap biçiminde de indirilebiliyor. Serinin dört cildi Zenodo'da arşivlendi ve ağustos ayında ISBN aldı; böylece kitaplar kalıcı numaralarla künyelenmiş oldu.</w:t>
       </w:r>
     </w:p>
     <w:p>

</xml_diff>